<commit_message>
Agrega portada institucional TEC a documentacion tecnica y manual de usuario
</commit_message>
<xml_diff>
--- a/Documentacion_Tecnica.docx
+++ b/Documentacion_Tecnica.docx
@@ -4,111 +4,253 @@
   <w:body>
     <w:p>
       <w:pPr>
-        <w:spacing w:before="1800"/>
+        <w:spacing w:after="600" w:before="600"/>
+        <w:jc w:val="center"/>
+      </w:pPr>
+      <w:r>
+        <w:drawing>
+          <wp:inline distT="0" distB="0" distL="0" distR="0">
+            <wp:extent cx="3619500" cy="914400"/>
+            <wp:effectExtent t="0" r="0" b="0" l="0"/>
+            <wp:docPr id="1" name="" descr="" title=""/>
+            <wp:cNvGraphicFramePr>
+              <a:graphicFrameLocks xmlns:a="http://schemas.openxmlformats.org/drawingml/2006/main" noChangeAspect="1"/>
+            </wp:cNvGraphicFramePr>
+            <a:graphic xmlns:a="http://schemas.openxmlformats.org/drawingml/2006/main">
+              <a:graphicData uri="http://schemas.openxmlformats.org/drawingml/2006/picture">
+                <pic:pic xmlns:pic="http://schemas.openxmlformats.org/drawingml/2006/picture">
+                  <pic:nvPicPr>
+                    <pic:cNvPr id="0" name="" descr=""/>
+                    <pic:cNvPicPr>
+                      <a:picLocks noChangeAspect="1" noChangeArrowheads="1"/>
+                    </pic:cNvPicPr>
+                  </pic:nvPicPr>
+                  <pic:blipFill>
+                    <a:blip r:embed="rId7" cstate="none"/>
+                    <a:srcRect/>
+                    <a:stretch>
+                      <a:fillRect/>
+                    </a:stretch>
+                  </pic:blipFill>
+                  <pic:spPr bwMode="auto">
+                    <a:xfrm>
+                      <a:off x="0" y="0"/>
+                      <a:ext cx="3619500" cy="914400"/>
+                    </a:xfrm>
+                    <a:prstGeom prst="rect">
+                      <a:avLst/>
+                    </a:prstGeom>
+                  </pic:spPr>
+                </pic:pic>
+              </a:graphicData>
+            </a:graphic>
+          </wp:inline>
+        </w:drawing>
+      </w:r>
+    </w:p>
+    <w:p>
+      <w:pPr>
+        <w:spacing w:after="300"/>
+      </w:pPr>
+    </w:p>
+    <w:p>
+      <w:pPr>
+        <w:spacing w:after="300"/>
+      </w:pPr>
+    </w:p>
+    <w:p>
+      <w:pPr>
+        <w:spacing w:after="60"/>
+        <w:jc w:val="center"/>
+      </w:pPr>
+      <w:r>
+        <w:rPr>
+          <w:b w:val="false"/>
+          <w:bCs w:val="false"/>
+          <w:sz w:val="28"/>
+          <w:szCs w:val="28"/>
+        </w:rPr>
+        <w:t xml:space="preserve">INSTITUTO TECNOLÓGICO DE COSTA RICA</w:t>
+      </w:r>
+    </w:p>
+    <w:p>
+      <w:pPr>
+        <w:spacing w:after="60"/>
+        <w:jc w:val="center"/>
+      </w:pPr>
+      <w:r>
+        <w:rPr>
+          <w:b w:val="false"/>
+          <w:bCs w:val="false"/>
+          <w:sz w:val="28"/>
+          <w:szCs w:val="28"/>
+        </w:rPr>
+        <w:t xml:space="preserve">UNIDAD DE COMPUTACIÓN</w:t>
+      </w:r>
+    </w:p>
+    <w:p>
+      <w:pPr>
+        <w:spacing w:after="60"/>
+        <w:jc w:val="center"/>
+      </w:pPr>
+      <w:r>
+        <w:rPr>
+          <w:b w:val="false"/>
+          <w:bCs w:val="false"/>
+          <w:sz w:val="28"/>
+          <w:szCs w:val="28"/>
+        </w:rPr>
+        <w:t xml:space="preserve">Campus Tecnológico Local San Carlos</w:t>
+      </w:r>
+    </w:p>
+    <w:p>
+      <w:pPr>
+        <w:spacing w:after="200"/>
+        <w:jc w:val="center"/>
+      </w:pPr>
+      <w:r>
+        <w:rPr>
+          <w:b w:val="false"/>
+          <w:bCs w:val="false"/>
+          <w:sz w:val="28"/>
+          <w:szCs w:val="28"/>
+        </w:rPr>
+        <w:t xml:space="preserve">IC-1802 Introducción a la Programación, G53</w:t>
+      </w:r>
+    </w:p>
+    <w:p>
+      <w:pPr>
+        <w:spacing w:after="100"/>
         <w:jc w:val="center"/>
       </w:pPr>
       <w:r>
         <w:rPr>
           <w:b/>
           <w:bCs/>
-          <w:color w:val="1F3864"/>
-          <w:sz w:val="48"/>
-          <w:szCs w:val="48"/>
-        </w:rPr>
-        <w:t xml:space="preserve">DOCUMENTACIÓN TÉCNICA</w:t>
-      </w:r>
-    </w:p>
-    <w:p>
-      <w:pPr>
-        <w:spacing w:before="160"/>
+          <w:sz w:val="28"/>
+          <w:szCs w:val="28"/>
+        </w:rPr>
+        <w:t xml:space="preserve">Proyecto II, Defensa y Asalto de Base</w:t>
+      </w:r>
+    </w:p>
+    <w:p>
+      <w:pPr>
+        <w:spacing w:after="400"/>
         <w:jc w:val="center"/>
       </w:pPr>
       <w:r>
         <w:rPr>
-          <w:color w:val="2E75B6"/>
+          <w:b/>
+          <w:bCs/>
+          <w:sz w:val="28"/>
+          <w:szCs w:val="28"/>
+        </w:rPr>
+        <w:t xml:space="preserve">Documentación Técnica</w:t>
+      </w:r>
+    </w:p>
+    <w:p>
+      <w:pPr>
+        <w:spacing w:after="60"/>
+        <w:jc w:val="center"/>
+      </w:pPr>
+      <w:r>
+        <w:rPr>
+          <w:b/>
+          <w:bCs/>
+          <w:sz w:val="28"/>
+          <w:szCs w:val="28"/>
+        </w:rPr>
+        <w:t xml:space="preserve">Estudiantes:</w:t>
+      </w:r>
+    </w:p>
+    <w:p>
+      <w:pPr>
+        <w:spacing w:after="40"/>
+        <w:jc w:val="center"/>
+      </w:pPr>
+      <w:r>
+        <w:rPr>
+          <w:b/>
+          <w:bCs/>
+          <w:sz w:val="28"/>
+          <w:szCs w:val="28"/>
+        </w:rPr>
+        <w:t xml:space="preserve">David De Jesús Zamora Villalobos</w:t>
+      </w:r>
+    </w:p>
+    <w:p>
+      <w:pPr>
+        <w:spacing w:after="400"/>
+        <w:jc w:val="center"/>
+      </w:pPr>
+      <w:r>
+        <w:rPr>
+          <w:b/>
+          <w:bCs/>
+          <w:sz w:val="28"/>
+          <w:szCs w:val="28"/>
+        </w:rPr>
+        <w:t xml:space="preserve">Josué Solano Monje</w:t>
+      </w:r>
+    </w:p>
+    <w:p>
+      <w:pPr>
+        <w:spacing w:after="60"/>
+        <w:jc w:val="center"/>
+      </w:pPr>
+      <w:r>
+        <w:rPr>
+          <w:b/>
+          <w:bCs/>
           <w:sz w:val="32"/>
           <w:szCs w:val="32"/>
         </w:rPr>
-        <w:t xml:space="preserve">Proyecto: Defensa y Asalto de Base</w:t>
-      </w:r>
-    </w:p>
-    <w:p>
-      <w:pPr>
-        <w:spacing w:before="600"/>
+        <w:t xml:space="preserve">Profesores:</w:t>
+      </w:r>
+    </w:p>
+    <w:p>
+      <w:pPr>
+        <w:spacing w:after="40"/>
         <w:jc w:val="center"/>
       </w:pPr>
       <w:r>
         <w:rPr>
-          <w:sz w:val="22"/>
-          <w:szCs w:val="22"/>
-        </w:rPr>
-        <w:t xml:space="preserve">Curso: Introducción a la Programación — Modalidad Live Learning</w:t>
-      </w:r>
-    </w:p>
-    <w:p>
-      <w:pPr>
+          <w:b w:val="false"/>
+          <w:bCs w:val="false"/>
+          <w:sz w:val="28"/>
+          <w:szCs w:val="28"/>
+        </w:rPr>
+        <w:t xml:space="preserve">Jeff Schmidt Peralta</w:t>
+      </w:r>
+    </w:p>
+    <w:p>
+      <w:pPr>
+        <w:spacing w:after="400"/>
         <w:jc w:val="center"/>
       </w:pPr>
       <w:r>
         <w:rPr>
-          <w:sz w:val="22"/>
-          <w:szCs w:val="22"/>
-        </w:rPr>
-        <w:t xml:space="preserve">Instituto Tecnológico de Costa Rica</w:t>
-      </w:r>
-    </w:p>
-    <w:p>
-      <w:pPr>
-        <w:spacing w:before="400"/>
+          <w:b w:val="false"/>
+          <w:bCs w:val="false"/>
+          <w:sz w:val="28"/>
+          <w:szCs w:val="28"/>
+        </w:rPr>
+        <w:t xml:space="preserve">Diego Andrés Mora Rojas</w:t>
+      </w:r>
+    </w:p>
+    <w:p>
+      <w:pPr>
+        <w:spacing w:after="0"/>
         <w:jc w:val="center"/>
       </w:pPr>
       <w:r>
         <w:rPr>
-          <w:b/>
-          <w:bCs/>
-          <w:sz w:val="24"/>
-          <w:szCs w:val="24"/>
-        </w:rPr>
-        <w:t xml:space="preserve">Integrantes:</w:t>
-      </w:r>
-    </w:p>
-    <w:p>
-      <w:pPr>
-        <w:jc w:val="center"/>
-      </w:pPr>
-      <w:r>
-        <w:rPr>
-          <w:sz w:val="22"/>
-          <w:szCs w:val="22"/>
-        </w:rPr>
-        <w:t xml:space="preserve">David Zamora Villalobos</w:t>
-      </w:r>
-    </w:p>
-    <w:p>
-      <w:pPr>
-        <w:jc w:val="center"/>
-      </w:pPr>
-      <w:r>
-        <w:rPr>
-          <w:sz w:val="22"/>
-          <w:szCs w:val="22"/>
-        </w:rPr>
-        <w:t xml:space="preserve">Josué Solano Monje</w:t>
-      </w:r>
-    </w:p>
-    <w:p>
-      <w:pPr>
-        <w:spacing w:before="200"/>
-        <w:jc w:val="center"/>
-      </w:pPr>
-      <w:r>
-        <w:rPr>
-          <w:i/>
-          <w:iCs/>
-          <w:sz w:val="22"/>
-          <w:szCs w:val="22"/>
-        </w:rPr>
-        <w:t xml:space="preserve">Junio 2026</w:t>
+          <w:b w:val="false"/>
+          <w:bCs w:val="false"/>
+          <w:sz w:val="28"/>
+          <w:szCs w:val="28"/>
+        </w:rPr>
+        <w:t xml:space="preserve">19 de junio del 2026</w:t>
       </w:r>
     </w:p>
     <w:p>
@@ -4037,7 +4179,7 @@
           <w:sz w:val="26"/>
           <w:szCs w:val="26"/>
         </w:rPr>
-        <w:t xml:space="preserve">David Zamora Villalobos</w:t>
+        <w:t xml:space="preserve">David De Jesús Zamora Villalobos</w:t>
       </w:r>
     </w:p>
     <w:p>

</xml_diff>

<commit_message>
Actualiza portada: nombre completo de Josue, carne de David, fecha de entrega 21/06/2026
</commit_message>
<xml_diff>
--- a/Documentacion_Tecnica.docx
+++ b/Documentacion_Tecnica.docx
@@ -175,7 +175,7 @@
           <w:sz w:val="28"/>
           <w:szCs w:val="28"/>
         </w:rPr>
-        <w:t xml:space="preserve">David De Jesús Zamora Villalobos</w:t>
+        <w:t xml:space="preserve">David De Jesús Zamora Villalobos, carné 2018107511</w:t>
       </w:r>
     </w:p>
     <w:p>
@@ -190,7 +190,7 @@
           <w:sz w:val="28"/>
           <w:szCs w:val="28"/>
         </w:rPr>
-        <w:t xml:space="preserve">Josué Solano Monje</w:t>
+        <w:t xml:space="preserve">Josué David Solano Monge</w:t>
       </w:r>
     </w:p>
     <w:p>
@@ -250,7 +250,7 @@
           <w:sz w:val="28"/>
           <w:szCs w:val="28"/>
         </w:rPr>
-        <w:t xml:space="preserve">19 de junio del 2026</w:t>
+        <w:t xml:space="preserve">21 de junio del 2026</w:t>
       </w:r>
     </w:p>
     <w:p>
@@ -4206,7 +4206,7 @@
           <w:sz w:val="26"/>
           <w:szCs w:val="26"/>
         </w:rPr>
-        <w:t xml:space="preserve">Josué Solano Monje</w:t>
+        <w:t xml:space="preserve">Josué David Solano Monge</w:t>
       </w:r>
     </w:p>
     <w:p>

</xml_diff>

<commit_message>
Agrega 5 capturas de pantalla a la Documentacion Tecnica
</commit_message>
<xml_diff>
--- a/Documentacion_Tecnica.docx
+++ b/Documentacion_Tecnica.docx
@@ -3872,6 +3872,302 @@
       <w:pPr>
         <w:spacing w:after="120"/>
       </w:pPr>
+    </w:p>
+    <w:p>
+      <w:pPr>
+        <w:pStyle w:val="Heading1"/>
+      </w:pPr>
+      <w:r>
+        <w:rPr>
+          <w:b/>
+          <w:bCs/>
+          <w:color w:val="1F3864"/>
+          <w:sz w:val="32"/>
+          <w:szCs w:val="32"/>
+        </w:rPr>
+        <w:t>9. Capturas de Pantalla</w:t>
+      </w:r>
+    </w:p>
+    <w:p>
+      <w:pPr>
+        <w:spacing w:after="120"/>
+      </w:pPr>
+      <w:r>
+        <w:rPr>
+          <w:sz w:val="22"/>
+        </w:rPr>
+        <w:t>A continuación se muestran las pantallas principales del juego Defensa y Asalto de Base.</w:t>
+      </w:r>
+    </w:p>
+    <w:p>
+      <w:pPr>
+        <w:spacing w:before="240" w:after="80"/>
+        <w:jc w:val="center"/>
+      </w:pPr>
+      <w:r>
+        <w:drawing>
+          <wp:inline xmlns:wp="http://schemas.openxmlformats.org/drawingml/2006/wordprocessingDrawing">
+            <wp:extent cx="6858000" cy="4114800"/>
+            <wp:effectExtent l="0" t="0" r="0" b="0"/>
+            <wp:docPr id="9" name="cap1" descr="Figura 1: Pantalla de inicio de sesion"/>
+            <a:graphic xmlns:a="http://schemas.openxmlformats.org/drawingml/2006/main">
+              <a:graphicData uri="http://schemas.openxmlformats.org/drawingml/2006/picture">
+                <pic:pic xmlns:pic="http://schemas.openxmlformats.org/drawingml/2006/picture">
+                  <pic:nvPicPr>
+                    <pic:cNvPr id="9" name="cap1"/>
+                    <pic:cNvPicPr/>
+                  </pic:nvPicPr>
+                  <pic:blipFill>
+                    <a:blip xmlns:r="http://schemas.openxmlformats.org/officeDocument/2006/relationships" r:embed="rId9"/>
+                    <a:stretch>
+                      <a:fillRect/>
+                    </a:stretch>
+                  </pic:blipFill>
+                  <pic:spPr>
+                    <a:xfrm>
+                      <a:off x="0" y="0"/>
+                      <a:ext cx="6858000" cy="4114800"/>
+                    </a:xfrm>
+                    <a:prstGeom prst="rect">
+                      <a:avLst/>
+                    </a:prstGeom>
+                  </pic:spPr>
+                </pic:pic>
+              </a:graphicData>
+            </a:graphic>
+          </wp:inline>
+        </w:drawing>
+      </w:r>
+    </w:p>
+    <w:p>
+      <w:pPr>
+        <w:spacing w:after="200"/>
+        <w:jc w:val="center"/>
+      </w:pPr>
+      <w:r>
+        <w:rPr>
+          <w:i/>
+          <w:sz w:val="18"/>
+          <w:color w:val="444444"/>
+        </w:rPr>
+        <w:t>Figura 1: Pantalla de inicio de sesión</w:t>
+      </w:r>
+    </w:p>
+    <w:p>
+      <w:pPr>
+        <w:spacing w:before="240" w:after="80"/>
+        <w:jc w:val="center"/>
+      </w:pPr>
+      <w:r>
+        <w:drawing>
+          <wp:inline xmlns:wp="http://schemas.openxmlformats.org/drawingml/2006/wordprocessingDrawing">
+            <wp:extent cx="6858000" cy="4114800"/>
+            <wp:effectExtent l="0" t="0" r="0" b="0"/>
+            <wp:docPr id="10" name="cap2" descr="Figura 2: Seleccion de faccion"/>
+            <a:graphic xmlns:a="http://schemas.openxmlformats.org/drawingml/2006/main">
+              <a:graphicData uri="http://schemas.openxmlformats.org/drawingml/2006/picture">
+                <pic:pic xmlns:pic="http://schemas.openxmlformats.org/drawingml/2006/picture">
+                  <pic:nvPicPr>
+                    <pic:cNvPr id="10" name="cap2"/>
+                    <pic:cNvPicPr/>
+                  </pic:nvPicPr>
+                  <pic:blipFill>
+                    <a:blip xmlns:r="http://schemas.openxmlformats.org/officeDocument/2006/relationships" r:embed="rId10"/>
+                    <a:stretch>
+                      <a:fillRect/>
+                    </a:stretch>
+                  </pic:blipFill>
+                  <pic:spPr>
+                    <a:xfrm>
+                      <a:off x="0" y="0"/>
+                      <a:ext cx="6858000" cy="4114800"/>
+                    </a:xfrm>
+                    <a:prstGeom prst="rect">
+                      <a:avLst/>
+                    </a:prstGeom>
+                  </pic:spPr>
+                </pic:pic>
+              </a:graphicData>
+            </a:graphic>
+          </wp:inline>
+        </w:drawing>
+      </w:r>
+    </w:p>
+    <w:p>
+      <w:pPr>
+        <w:spacing w:after="200"/>
+        <w:jc w:val="center"/>
+      </w:pPr>
+      <w:r>
+        <w:rPr>
+          <w:i/>
+          <w:sz w:val="18"/>
+          <w:color w:val="444444"/>
+        </w:rPr>
+        <w:t>Figura 2: Selección de faccíon</w:t>
+      </w:r>
+    </w:p>
+    <w:p>
+      <w:pPr>
+        <w:spacing w:before="240" w:after="80"/>
+        <w:jc w:val="center"/>
+      </w:pPr>
+      <w:r>
+        <w:drawing>
+          <wp:inline xmlns:wp="http://schemas.openxmlformats.org/drawingml/2006/wordprocessingDrawing">
+            <wp:extent cx="6858000" cy="4114800"/>
+            <wp:effectExtent l="0" t="0" r="0" b="0"/>
+            <wp:docPr id="11" name="cap3" descr="Figura 3: Fase del defensor colocando torres"/>
+            <a:graphic xmlns:a="http://schemas.openxmlformats.org/drawingml/2006/main">
+              <a:graphicData uri="http://schemas.openxmlformats.org/drawingml/2006/picture">
+                <pic:pic xmlns:pic="http://schemas.openxmlformats.org/drawingml/2006/picture">
+                  <pic:nvPicPr>
+                    <pic:cNvPr id="11" name="cap3"/>
+                    <pic:cNvPicPr/>
+                  </pic:nvPicPr>
+                  <pic:blipFill>
+                    <a:blip xmlns:r="http://schemas.openxmlformats.org/officeDocument/2006/relationships" r:embed="rId11"/>
+                    <a:stretch>
+                      <a:fillRect/>
+                    </a:stretch>
+                  </pic:blipFill>
+                  <pic:spPr>
+                    <a:xfrm>
+                      <a:off x="0" y="0"/>
+                      <a:ext cx="6858000" cy="4114800"/>
+                    </a:xfrm>
+                    <a:prstGeom prst="rect">
+                      <a:avLst/>
+                    </a:prstGeom>
+                  </pic:spPr>
+                </pic:pic>
+              </a:graphicData>
+            </a:graphic>
+          </wp:inline>
+        </w:drawing>
+      </w:r>
+    </w:p>
+    <w:p>
+      <w:pPr>
+        <w:spacing w:after="200"/>
+        <w:jc w:val="center"/>
+      </w:pPr>
+      <w:r>
+        <w:rPr>
+          <w:i/>
+          <w:sz w:val="18"/>
+          <w:color w:val="444444"/>
+        </w:rPr>
+        <w:t>Figura 3: Fase del defensor colocando torres</w:t>
+      </w:r>
+    </w:p>
+    <w:p>
+      <w:pPr>
+        <w:spacing w:before="240" w:after="80"/>
+        <w:jc w:val="center"/>
+      </w:pPr>
+      <w:r>
+        <w:drawing>
+          <wp:inline xmlns:wp="http://schemas.openxmlformats.org/drawingml/2006/wordprocessingDrawing">
+            <wp:extent cx="6858000" cy="4114800"/>
+            <wp:effectExtent l="0" t="0" r="0" b="0"/>
+            <wp:docPr id="12" name="cap4" descr="Figura 4: Combate en progreso"/>
+            <a:graphic xmlns:a="http://schemas.openxmlformats.org/drawingml/2006/main">
+              <a:graphicData uri="http://schemas.openxmlformats.org/drawingml/2006/picture">
+                <pic:pic xmlns:pic="http://schemas.openxmlformats.org/drawingml/2006/picture">
+                  <pic:nvPicPr>
+                    <pic:cNvPr id="12" name="cap4"/>
+                    <pic:cNvPicPr/>
+                  </pic:nvPicPr>
+                  <pic:blipFill>
+                    <a:blip xmlns:r="http://schemas.openxmlformats.org/officeDocument/2006/relationships" r:embed="rId12"/>
+                    <a:stretch>
+                      <a:fillRect/>
+                    </a:stretch>
+                  </pic:blipFill>
+                  <pic:spPr>
+                    <a:xfrm>
+                      <a:off x="0" y="0"/>
+                      <a:ext cx="6858000" cy="4114800"/>
+                    </a:xfrm>
+                    <a:prstGeom prst="rect">
+                      <a:avLst/>
+                    </a:prstGeom>
+                  </pic:spPr>
+                </pic:pic>
+              </a:graphicData>
+            </a:graphic>
+          </wp:inline>
+        </w:drawing>
+      </w:r>
+    </w:p>
+    <w:p>
+      <w:pPr>
+        <w:spacing w:after="200"/>
+        <w:jc w:val="center"/>
+      </w:pPr>
+      <w:r>
+        <w:rPr>
+          <w:i/>
+          <w:sz w:val="18"/>
+          <w:color w:val="444444"/>
+        </w:rPr>
+        <w:t>Figura 4: Combate en progreso</w:t>
+      </w:r>
+    </w:p>
+    <w:p>
+      <w:pPr>
+        <w:spacing w:before="240" w:after="80"/>
+        <w:jc w:val="center"/>
+      </w:pPr>
+      <w:r>
+        <w:drawing>
+          <wp:inline xmlns:wp="http://schemas.openxmlformats.org/drawingml/2006/wordprocessingDrawing">
+            <wp:extent cx="6858000" cy="4114800"/>
+            <wp:effectExtent l="0" t="0" r="0" b="0"/>
+            <wp:docPr id="13" name="cap5" descr="Figura 5: Pantalla de fin y ranking"/>
+            <a:graphic xmlns:a="http://schemas.openxmlformats.org/drawingml/2006/main">
+              <a:graphicData uri="http://schemas.openxmlformats.org/drawingml/2006/picture">
+                <pic:pic xmlns:pic="http://schemas.openxmlformats.org/drawingml/2006/picture">
+                  <pic:nvPicPr>
+                    <pic:cNvPr id="13" name="cap5"/>
+                    <pic:cNvPicPr/>
+                  </pic:nvPicPr>
+                  <pic:blipFill>
+                    <a:blip xmlns:r="http://schemas.openxmlformats.org/officeDocument/2006/relationships" r:embed="rId13"/>
+                    <a:stretch>
+                      <a:fillRect/>
+                    </a:stretch>
+                  </pic:blipFill>
+                  <pic:spPr>
+                    <a:xfrm>
+                      <a:off x="0" y="0"/>
+                      <a:ext cx="6858000" cy="4114800"/>
+                    </a:xfrm>
+                    <a:prstGeom prst="rect">
+                      <a:avLst/>
+                    </a:prstGeom>
+                  </pic:spPr>
+                </pic:pic>
+              </a:graphicData>
+            </a:graphic>
+          </wp:inline>
+        </w:drawing>
+      </w:r>
+    </w:p>
+    <w:p>
+      <w:pPr>
+        <w:spacing w:after="200"/>
+        <w:jc w:val="center"/>
+      </w:pPr>
+      <w:r>
+        <w:rPr>
+          <w:i/>
+          <w:sz w:val="18"/>
+          <w:color w:val="444444"/>
+        </w:rPr>
+        <w:t>Figura 5: Pantalla de fin y ranking de jugadores</w:t>
+      </w:r>
     </w:p>
     <w:p>
       <w:pPr>

</xml_diff>

<commit_message>
Agrega captura de pantalla del login en la seccion 12 de documentacion tecnica
</commit_message>
<xml_diff>
--- a/Documentacion_Tecnica.docx
+++ b/Documentacion_Tecnica.docx
@@ -3885,7 +3885,7 @@
           <w:sz w:val="32"/>
           <w:szCs w:val="32"/>
         </w:rPr>
-        <w:t>9. Capturas de Pantalla</w:t>
+        <w:t xml:space="preserve">9. Flujo del Motor de Combate</w:t>
       </w:r>
     </w:p>
     <w:p>
@@ -3895,38 +3895,339 @@
       <w:r>
         <w:rPr>
           <w:sz w:val="22"/>
-        </w:rPr>
-        <w:t>A continuación se muestran las pantallas principales del juego Defensa y Asalto de Base.</w:t>
-      </w:r>
-    </w:p>
-    <w:p>
-      <w:pPr>
-        <w:spacing w:before="240" w:after="80"/>
+          <w:szCs w:val="22"/>
+        </w:rPr>
+        <w:t xml:space="preserve">El método Juego.ejecutar_combate() implementa el ciclo de combate por turnos:</w:t>
+      </w:r>
+    </w:p>
+    <w:p>
+      <w:pPr>
+        <w:pStyle w:val="ListParagraph"/>
+        <w:numPr>
+          <w:ilvl w:val="0"/>
+          <w:numId w:val="2"/>
+        </w:numPr>
+        <w:spacing w:after="80"/>
+      </w:pPr>
+      <w:r>
+        <w:rPr>
+          <w:sz w:val="22"/>
+          <w:szCs w:val="22"/>
+        </w:rPr>
+        <w:t xml:space="preserve">Cada torre busca unidades dentro de su alcance (distancia Manhattan) y las ataca.</w:t>
+      </w:r>
+    </w:p>
+    <w:p>
+      <w:pPr>
+        <w:pStyle w:val="ListParagraph"/>
+        <w:numPr>
+          <w:ilvl w:val="0"/>
+          <w:numId w:val="2"/>
+        </w:numPr>
+        <w:spacing w:after="80"/>
+      </w:pPr>
+      <w:r>
+        <w:rPr>
+          <w:sz w:val="22"/>
+          <w:szCs w:val="22"/>
+        </w:rPr>
+        <w:t xml:space="preserve">Las torres activan su habilidad especial cada N turnos configurados.</w:t>
+      </w:r>
+    </w:p>
+    <w:p>
+      <w:pPr>
+        <w:pStyle w:val="ListParagraph"/>
+        <w:numPr>
+          <w:ilvl w:val="0"/>
+          <w:numId w:val="2"/>
+        </w:numPr>
+        <w:spacing w:after="80"/>
+      </w:pPr>
+      <w:r>
+        <w:rPr>
+          <w:sz w:val="22"/>
+          <w:szCs w:val="22"/>
+        </w:rPr>
+        <w:t xml:space="preserve">Las unidades muertas se eliminan del mapa.</w:t>
+      </w:r>
+    </w:p>
+    <w:p>
+      <w:pPr>
+        <w:pStyle w:val="ListParagraph"/>
+        <w:numPr>
+          <w:ilvl w:val="0"/>
+          <w:numId w:val="2"/>
+        </w:numPr>
+        <w:spacing w:after="80"/>
+      </w:pPr>
+      <w:r>
+        <w:rPr>
+          <w:sz w:val="22"/>
+          <w:szCs w:val="22"/>
+        </w:rPr>
+        <w:t xml:space="preserve">Cada unidad se mueve hacia la base usando búsqueda greedy (menor distancia Manhattan).</w:t>
+      </w:r>
+    </w:p>
+    <w:p>
+      <w:pPr>
+        <w:pStyle w:val="ListParagraph"/>
+        <w:numPr>
+          <w:ilvl w:val="0"/>
+          <w:numId w:val="2"/>
+        </w:numPr>
+        <w:spacing w:after="80"/>
+      </w:pPr>
+      <w:r>
+        <w:rPr>
+          <w:sz w:val="22"/>
+          <w:szCs w:val="22"/>
+        </w:rPr>
+        <w:t xml:space="preserve">Si una unidad alcanza la base, la ataca. Si la base llega a 0 HP, el atacante gana.</w:t>
+      </w:r>
+    </w:p>
+    <w:p>
+      <w:pPr>
+        <w:pStyle w:val="ListParagraph"/>
+        <w:numPr>
+          <w:ilvl w:val="0"/>
+          <w:numId w:val="2"/>
+        </w:numPr>
+        <w:spacing w:after="120"/>
+      </w:pPr>
+      <w:r>
+        <w:rPr>
+          <w:sz w:val="22"/>
+          <w:szCs w:val="22"/>
+        </w:rPr>
+        <w:t xml:space="preserve">Si no quedan unidades, el defensor gana. Si se agotan los 50 turnos, el defensor gana.</w:t>
+      </w:r>
+    </w:p>
+    <w:p>
+      <w:pPr>
+        <w:pStyle w:val="Heading1"/>
+      </w:pPr>
+      <w:r>
+        <w:rPr>
+          <w:b/>
+          <w:bCs/>
+          <w:color w:val="1F3864"/>
+          <w:sz w:val="32"/>
+          <w:szCs w:val="32"/>
+        </w:rPr>
+        <w:t xml:space="preserve">10. Repositorio y Video</w:t>
+      </w:r>
+    </w:p>
+    <w:p>
+      <w:pPr>
+        <w:spacing w:after="120"/>
+      </w:pPr>
+      <w:r>
+        <w:rPr>
+          <w:b/>
+          <w:bCs/>
+          <w:sz w:val="22"/>
+          <w:szCs w:val="22"/>
+        </w:rPr>
+        <w:t xml:space="preserve">Repositorio GitHub:</w:t>
+      </w:r>
+    </w:p>
+    <w:p>
+      <w:pPr>
+        <w:spacing w:after="120"/>
+      </w:pPr>
+      <w:r>
+        <w:rPr>
+          <w:sz w:val="22"/>
+          <w:szCs w:val="22"/>
+        </w:rPr>
+        <w:t xml:space="preserve">https://github.com/JosueSolano2008/Proyecto_2_Defensa_Asalto_Base</w:t>
+      </w:r>
+    </w:p>
+    <w:p>
+      <w:pPr>
+        <w:spacing w:after="120"/>
+      </w:pPr>
+      <w:r>
+        <w:rPr>
+          <w:b/>
+          <w:bCs/>
+          <w:sz w:val="22"/>
+          <w:szCs w:val="22"/>
+        </w:rPr>
+        <w:t xml:space="preserve">Video evidencia de desarrollo (10 min):</w:t>
+      </w:r>
+    </w:p>
+    <w:p>
+      <w:pPr>
+        <w:spacing w:after="120"/>
+      </w:pPr>
+      <w:r>
+        <w:rPr>
+          <w:sz w:val="22"/>
+          <w:szCs w:val="22"/>
+        </w:rPr>
+        <w:t xml:space="preserve">[Enlace al video — pendiente de agregar]</w:t>
+      </w:r>
+    </w:p>
+    <w:p>
+      <w:pPr>
+        <w:pStyle w:val="Heading1"/>
+      </w:pPr>
+      <w:r>
+        <w:rPr>
+          <w:b/>
+          <w:bCs/>
+          <w:color w:val="1F3864"/>
+          <w:sz w:val="32"/>
+          <w:szCs w:val="32"/>
+        </w:rPr>
+        <w:t xml:space="preserve">11. Instrucciones para Ejecutar</w:t>
+      </w:r>
+    </w:p>
+    <w:p>
+      <w:pPr>
+        <w:pStyle w:val="ListParagraph"/>
+        <w:numPr>
+          <w:ilvl w:val="0"/>
+          <w:numId w:val="3"/>
+        </w:numPr>
+        <w:spacing w:after="80"/>
+      </w:pPr>
+      <w:r>
+        <w:rPr>
+          <w:sz w:val="22"/>
+          <w:szCs w:val="22"/>
+        </w:rPr>
+        <w:t xml:space="preserve">Descomprimir el .zip en una carpeta local</w:t>
+      </w:r>
+    </w:p>
+    <w:p>
+      <w:pPr>
+        <w:pStyle w:val="ListParagraph"/>
+        <w:numPr>
+          <w:ilvl w:val="0"/>
+          <w:numId w:val="3"/>
+        </w:numPr>
+        <w:spacing w:after="80"/>
+      </w:pPr>
+      <w:r>
+        <w:rPr>
+          <w:sz w:val="22"/>
+          <w:szCs w:val="22"/>
+        </w:rPr>
+        <w:t xml:space="preserve">Navegar a la carpeta proyecto_final/ desde la terminal</w:t>
+      </w:r>
+    </w:p>
+    <w:p>
+      <w:pPr>
+        <w:pStyle w:val="ListParagraph"/>
+        <w:numPr>
+          <w:ilvl w:val="0"/>
+          <w:numId w:val="3"/>
+        </w:numPr>
+        <w:spacing w:after="80"/>
+      </w:pPr>
+      <w:r>
+        <w:rPr>
+          <w:sz w:val="22"/>
+          <w:szCs w:val="22"/>
+        </w:rPr>
+        <w:t xml:space="preserve">Ejecutar: pip install Pillow</w:t>
+      </w:r>
+    </w:p>
+    <w:p>
+      <w:pPr>
+        <w:pStyle w:val="ListParagraph"/>
+        <w:numPr>
+          <w:ilvl w:val="0"/>
+          <w:numId w:val="3"/>
+        </w:numPr>
+        <w:spacing w:after="80"/>
+      </w:pPr>
+      <w:r>
+        <w:rPr>
+          <w:sz w:val="22"/>
+          <w:szCs w:val="22"/>
+        </w:rPr>
+        <w:t xml:space="preserve">Ejecutar: python main.py</w:t>
+      </w:r>
+    </w:p>
+    <w:p>
+      <w:pPr>
+        <w:pStyle w:val="Heading1"/>
+      </w:pPr>
+      <w:r>
+        <w:rPr>
+          <w:b/>
+          <w:bCs/>
+          <w:color w:val="1F3864"/>
+          <w:sz w:val="32"/>
+          <w:szCs w:val="32"/>
+        </w:rPr>
+        <w:t xml:space="preserve">12. Capturas de Pantalla</w:t>
+      </w:r>
+    </w:p>
+    <w:p>
+      <w:pPr>
+        <w:pStyle w:val="Heading2"/>
+      </w:pPr>
+      <w:r>
+        <w:rPr>
+          <w:b/>
+          <w:bCs/>
+          <w:color w:val="2E75B6"/>
+          <w:sz w:val="26"/>
+          <w:szCs w:val="26"/>
+        </w:rPr>
+        <w:t xml:space="preserve">12.1 Pantalla de Login</w:t>
+      </w:r>
+    </w:p>
+    <w:p>
+      <w:pPr>
+        <w:spacing w:after="120"/>
+      </w:pPr>
+      <w:r>
+        <w:rPr>
+          <w:sz w:val="22"/>
+          <w:szCs w:val="22"/>
+        </w:rPr>
+        <w:t xml:space="preserve">La pantalla de inicio de sesión permite a ambos jugadores autenticarse antes de comenzar la partida. Cada jugador ingresa su usuario y contraseña. El sistema confirma la sesión con un mensaje verde.</w:t>
+      </w:r>
+    </w:p>
+    <w:p>
+      <w:pPr>
+        <w:spacing w:after="200"/>
         <w:jc w:val="center"/>
       </w:pPr>
       <w:r>
         <w:drawing>
-          <wp:inline xmlns:wp="http://schemas.openxmlformats.org/drawingml/2006/wordprocessingDrawing">
-            <wp:extent cx="6858000" cy="4114800"/>
-            <wp:effectExtent l="0" t="0" r="0" b="0"/>
-            <wp:docPr id="9" name="cap1" descr="Figura 1: Pantalla de inicio de sesion"/>
+          <wp:inline distT="0" distB="0" distL="0" distR="0">
+            <wp:extent cx="3238500" cy="3448050"/>
+            <wp:effectExtent t="0" r="0" b="0" l="0"/>
+            <wp:docPr id="1" name="" descr="" title=""/>
+            <wp:cNvGraphicFramePr>
+              <a:graphicFrameLocks xmlns:a="http://schemas.openxmlformats.org/drawingml/2006/main" noChangeAspect="1"/>
+            </wp:cNvGraphicFramePr>
             <a:graphic xmlns:a="http://schemas.openxmlformats.org/drawingml/2006/main">
               <a:graphicData uri="http://schemas.openxmlformats.org/drawingml/2006/picture">
                 <pic:pic xmlns:pic="http://schemas.openxmlformats.org/drawingml/2006/picture">
                   <pic:nvPicPr>
-                    <pic:cNvPr id="9" name="cap1"/>
-                    <pic:cNvPicPr/>
+                    <pic:cNvPr id="0" name="" descr=""/>
+                    <pic:cNvPicPr>
+                      <a:picLocks noChangeAspect="1" noChangeArrowheads="1"/>
+                    </pic:cNvPicPr>
                   </pic:nvPicPr>
                   <pic:blipFill>
-                    <a:blip xmlns:r="http://schemas.openxmlformats.org/officeDocument/2006/relationships" r:embed="rId9"/>
+                    <a:blip r:embed="rId8" cstate="none"/>
+                    <a:srcRect/>
                     <a:stretch>
                       <a:fillRect/>
                     </a:stretch>
                   </pic:blipFill>
-                  <pic:spPr>
+                  <pic:spPr bwMode="auto">
                     <a:xfrm>
                       <a:off x="0" y="0"/>
-                      <a:ext cx="6858000" cy="4114800"/>
+                      <a:ext cx="3238500" cy="3448050"/>
                     </a:xfrm>
                     <a:prstGeom prst="rect">
                       <a:avLst/>
@@ -3941,236 +4242,6 @@
     </w:p>
     <w:p>
       <w:pPr>
-        <w:spacing w:after="200"/>
-        <w:jc w:val="center"/>
-      </w:pPr>
-      <w:r>
-        <w:rPr>
-          <w:i/>
-          <w:sz w:val="18"/>
-          <w:color w:val="444444"/>
-        </w:rPr>
-        <w:t>Figura 1: Pantalla de inicio de sesión</w:t>
-      </w:r>
-    </w:p>
-    <w:p>
-      <w:pPr>
-        <w:spacing w:before="240" w:after="80"/>
-        <w:jc w:val="center"/>
-      </w:pPr>
-      <w:r>
-        <w:drawing>
-          <wp:inline xmlns:wp="http://schemas.openxmlformats.org/drawingml/2006/wordprocessingDrawing">
-            <wp:extent cx="6858000" cy="4114800"/>
-            <wp:effectExtent l="0" t="0" r="0" b="0"/>
-            <wp:docPr id="10" name="cap2" descr="Figura 2: Seleccion de faccion"/>
-            <a:graphic xmlns:a="http://schemas.openxmlformats.org/drawingml/2006/main">
-              <a:graphicData uri="http://schemas.openxmlformats.org/drawingml/2006/picture">
-                <pic:pic xmlns:pic="http://schemas.openxmlformats.org/drawingml/2006/picture">
-                  <pic:nvPicPr>
-                    <pic:cNvPr id="10" name="cap2"/>
-                    <pic:cNvPicPr/>
-                  </pic:nvPicPr>
-                  <pic:blipFill>
-                    <a:blip xmlns:r="http://schemas.openxmlformats.org/officeDocument/2006/relationships" r:embed="rId10"/>
-                    <a:stretch>
-                      <a:fillRect/>
-                    </a:stretch>
-                  </pic:blipFill>
-                  <pic:spPr>
-                    <a:xfrm>
-                      <a:off x="0" y="0"/>
-                      <a:ext cx="6858000" cy="4114800"/>
-                    </a:xfrm>
-                    <a:prstGeom prst="rect">
-                      <a:avLst/>
-                    </a:prstGeom>
-                  </pic:spPr>
-                </pic:pic>
-              </a:graphicData>
-            </a:graphic>
-          </wp:inline>
-        </w:drawing>
-      </w:r>
-    </w:p>
-    <w:p>
-      <w:pPr>
-        <w:spacing w:after="200"/>
-        <w:jc w:val="center"/>
-      </w:pPr>
-      <w:r>
-        <w:rPr>
-          <w:i/>
-          <w:sz w:val="18"/>
-          <w:color w:val="444444"/>
-        </w:rPr>
-        <w:t>Figura 2: Selección de faccíon</w:t>
-      </w:r>
-    </w:p>
-    <w:p>
-      <w:pPr>
-        <w:spacing w:before="240" w:after="80"/>
-        <w:jc w:val="center"/>
-      </w:pPr>
-      <w:r>
-        <w:drawing>
-          <wp:inline xmlns:wp="http://schemas.openxmlformats.org/drawingml/2006/wordprocessingDrawing">
-            <wp:extent cx="6858000" cy="4114800"/>
-            <wp:effectExtent l="0" t="0" r="0" b="0"/>
-            <wp:docPr id="11" name="cap3" descr="Figura 3: Fase del defensor colocando torres"/>
-            <a:graphic xmlns:a="http://schemas.openxmlformats.org/drawingml/2006/main">
-              <a:graphicData uri="http://schemas.openxmlformats.org/drawingml/2006/picture">
-                <pic:pic xmlns:pic="http://schemas.openxmlformats.org/drawingml/2006/picture">
-                  <pic:nvPicPr>
-                    <pic:cNvPr id="11" name="cap3"/>
-                    <pic:cNvPicPr/>
-                  </pic:nvPicPr>
-                  <pic:blipFill>
-                    <a:blip xmlns:r="http://schemas.openxmlformats.org/officeDocument/2006/relationships" r:embed="rId11"/>
-                    <a:stretch>
-                      <a:fillRect/>
-                    </a:stretch>
-                  </pic:blipFill>
-                  <pic:spPr>
-                    <a:xfrm>
-                      <a:off x="0" y="0"/>
-                      <a:ext cx="6858000" cy="4114800"/>
-                    </a:xfrm>
-                    <a:prstGeom prst="rect">
-                      <a:avLst/>
-                    </a:prstGeom>
-                  </pic:spPr>
-                </pic:pic>
-              </a:graphicData>
-            </a:graphic>
-          </wp:inline>
-        </w:drawing>
-      </w:r>
-    </w:p>
-    <w:p>
-      <w:pPr>
-        <w:spacing w:after="200"/>
-        <w:jc w:val="center"/>
-      </w:pPr>
-      <w:r>
-        <w:rPr>
-          <w:i/>
-          <w:sz w:val="18"/>
-          <w:color w:val="444444"/>
-        </w:rPr>
-        <w:t>Figura 3: Fase del defensor colocando torres</w:t>
-      </w:r>
-    </w:p>
-    <w:p>
-      <w:pPr>
-        <w:spacing w:before="240" w:after="80"/>
-        <w:jc w:val="center"/>
-      </w:pPr>
-      <w:r>
-        <w:drawing>
-          <wp:inline xmlns:wp="http://schemas.openxmlformats.org/drawingml/2006/wordprocessingDrawing">
-            <wp:extent cx="6858000" cy="4114800"/>
-            <wp:effectExtent l="0" t="0" r="0" b="0"/>
-            <wp:docPr id="12" name="cap4" descr="Figura 4: Combate en progreso"/>
-            <a:graphic xmlns:a="http://schemas.openxmlformats.org/drawingml/2006/main">
-              <a:graphicData uri="http://schemas.openxmlformats.org/drawingml/2006/picture">
-                <pic:pic xmlns:pic="http://schemas.openxmlformats.org/drawingml/2006/picture">
-                  <pic:nvPicPr>
-                    <pic:cNvPr id="12" name="cap4"/>
-                    <pic:cNvPicPr/>
-                  </pic:nvPicPr>
-                  <pic:blipFill>
-                    <a:blip xmlns:r="http://schemas.openxmlformats.org/officeDocument/2006/relationships" r:embed="rId12"/>
-                    <a:stretch>
-                      <a:fillRect/>
-                    </a:stretch>
-                  </pic:blipFill>
-                  <pic:spPr>
-                    <a:xfrm>
-                      <a:off x="0" y="0"/>
-                      <a:ext cx="6858000" cy="4114800"/>
-                    </a:xfrm>
-                    <a:prstGeom prst="rect">
-                      <a:avLst/>
-                    </a:prstGeom>
-                  </pic:spPr>
-                </pic:pic>
-              </a:graphicData>
-            </a:graphic>
-          </wp:inline>
-        </w:drawing>
-      </w:r>
-    </w:p>
-    <w:p>
-      <w:pPr>
-        <w:spacing w:after="200"/>
-        <w:jc w:val="center"/>
-      </w:pPr>
-      <w:r>
-        <w:rPr>
-          <w:i/>
-          <w:sz w:val="18"/>
-          <w:color w:val="444444"/>
-        </w:rPr>
-        <w:t>Figura 4: Combate en progreso</w:t>
-      </w:r>
-    </w:p>
-    <w:p>
-      <w:pPr>
-        <w:spacing w:before="240" w:after="80"/>
-        <w:jc w:val="center"/>
-      </w:pPr>
-      <w:r>
-        <w:drawing>
-          <wp:inline xmlns:wp="http://schemas.openxmlformats.org/drawingml/2006/wordprocessingDrawing">
-            <wp:extent cx="6858000" cy="4114800"/>
-            <wp:effectExtent l="0" t="0" r="0" b="0"/>
-            <wp:docPr id="13" name="cap5" descr="Figura 5: Pantalla de fin y ranking"/>
-            <a:graphic xmlns:a="http://schemas.openxmlformats.org/drawingml/2006/main">
-              <a:graphicData uri="http://schemas.openxmlformats.org/drawingml/2006/picture">
-                <pic:pic xmlns:pic="http://schemas.openxmlformats.org/drawingml/2006/picture">
-                  <pic:nvPicPr>
-                    <pic:cNvPr id="13" name="cap5"/>
-                    <pic:cNvPicPr/>
-                  </pic:nvPicPr>
-                  <pic:blipFill>
-                    <a:blip xmlns:r="http://schemas.openxmlformats.org/officeDocument/2006/relationships" r:embed="rId13"/>
-                    <a:stretch>
-                      <a:fillRect/>
-                    </a:stretch>
-                  </pic:blipFill>
-                  <pic:spPr>
-                    <a:xfrm>
-                      <a:off x="0" y="0"/>
-                      <a:ext cx="6858000" cy="4114800"/>
-                    </a:xfrm>
-                    <a:prstGeom prst="rect">
-                      <a:avLst/>
-                    </a:prstGeom>
-                  </pic:spPr>
-                </pic:pic>
-              </a:graphicData>
-            </a:graphic>
-          </wp:inline>
-        </w:drawing>
-      </w:r>
-    </w:p>
-    <w:p>
-      <w:pPr>
-        <w:spacing w:after="200"/>
-        <w:jc w:val="center"/>
-      </w:pPr>
-      <w:r>
-        <w:rPr>
-          <w:i/>
-          <w:sz w:val="18"/>
-          <w:color w:val="444444"/>
-        </w:rPr>
-        <w:t>Figura 5: Pantalla de fin y ranking de jugadores</w:t>
-      </w:r>
-    </w:p>
-    <w:p>
-      <w:pPr>
         <w:pStyle w:val="Heading1"/>
       </w:pPr>
       <w:r>
@@ -4181,286 +4252,7 @@
           <w:sz w:val="32"/>
           <w:szCs w:val="32"/>
         </w:rPr>
-        <w:t xml:space="preserve">9. Flujo del Motor de Combate</w:t>
-      </w:r>
-    </w:p>
-    <w:p>
-      <w:pPr>
-        <w:spacing w:after="120"/>
-      </w:pPr>
-      <w:r>
-        <w:rPr>
-          <w:sz w:val="22"/>
-          <w:szCs w:val="22"/>
-        </w:rPr>
-        <w:t xml:space="preserve">El método Juego.ejecutar_combate() implementa el ciclo de combate por turnos:</w:t>
-      </w:r>
-    </w:p>
-    <w:p>
-      <w:pPr>
-        <w:pStyle w:val="ListParagraph"/>
-        <w:numPr>
-          <w:ilvl w:val="0"/>
-          <w:numId w:val="2"/>
-        </w:numPr>
-        <w:spacing w:after="80"/>
-      </w:pPr>
-      <w:r>
-        <w:rPr>
-          <w:sz w:val="22"/>
-          <w:szCs w:val="22"/>
-        </w:rPr>
-        <w:t xml:space="preserve">Cada torre busca unidades dentro de su alcance (distancia Manhattan) y las ataca.</w:t>
-      </w:r>
-    </w:p>
-    <w:p>
-      <w:pPr>
-        <w:pStyle w:val="ListParagraph"/>
-        <w:numPr>
-          <w:ilvl w:val="0"/>
-          <w:numId w:val="2"/>
-        </w:numPr>
-        <w:spacing w:after="80"/>
-      </w:pPr>
-      <w:r>
-        <w:rPr>
-          <w:sz w:val="22"/>
-          <w:szCs w:val="22"/>
-        </w:rPr>
-        <w:t xml:space="preserve">Las torres activan su habilidad especial cada N turnos configurados.</w:t>
-      </w:r>
-    </w:p>
-    <w:p>
-      <w:pPr>
-        <w:pStyle w:val="ListParagraph"/>
-        <w:numPr>
-          <w:ilvl w:val="0"/>
-          <w:numId w:val="2"/>
-        </w:numPr>
-        <w:spacing w:after="80"/>
-      </w:pPr>
-      <w:r>
-        <w:rPr>
-          <w:sz w:val="22"/>
-          <w:szCs w:val="22"/>
-        </w:rPr>
-        <w:t xml:space="preserve">Las unidades muertas se eliminan del mapa.</w:t>
-      </w:r>
-    </w:p>
-    <w:p>
-      <w:pPr>
-        <w:pStyle w:val="ListParagraph"/>
-        <w:numPr>
-          <w:ilvl w:val="0"/>
-          <w:numId w:val="2"/>
-        </w:numPr>
-        <w:spacing w:after="80"/>
-      </w:pPr>
-      <w:r>
-        <w:rPr>
-          <w:sz w:val="22"/>
-          <w:szCs w:val="22"/>
-        </w:rPr>
-        <w:t xml:space="preserve">Cada unidad se mueve hacia la base usando búsqueda greedy (menor distancia Manhattan).</w:t>
-      </w:r>
-    </w:p>
-    <w:p>
-      <w:pPr>
-        <w:pStyle w:val="ListParagraph"/>
-        <w:numPr>
-          <w:ilvl w:val="0"/>
-          <w:numId w:val="2"/>
-        </w:numPr>
-        <w:spacing w:after="80"/>
-      </w:pPr>
-      <w:r>
-        <w:rPr>
-          <w:sz w:val="22"/>
-          <w:szCs w:val="22"/>
-        </w:rPr>
-        <w:t xml:space="preserve">Si una unidad alcanza la base, la ataca. Si la base llega a 0 HP, el atacante gana.</w:t>
-      </w:r>
-    </w:p>
-    <w:p>
-      <w:pPr>
-        <w:pStyle w:val="ListParagraph"/>
-        <w:numPr>
-          <w:ilvl w:val="0"/>
-          <w:numId w:val="2"/>
-        </w:numPr>
-        <w:spacing w:after="120"/>
-      </w:pPr>
-      <w:r>
-        <w:rPr>
-          <w:sz w:val="22"/>
-          <w:szCs w:val="22"/>
-        </w:rPr>
-        <w:t xml:space="preserve">Si no quedan unidades, el defensor gana. Si se agotan los 50 turnos, el defensor gana.</w:t>
-      </w:r>
-    </w:p>
-    <w:p>
-      <w:pPr>
-        <w:pStyle w:val="Heading1"/>
-      </w:pPr>
-      <w:r>
-        <w:rPr>
-          <w:b/>
-          <w:bCs/>
-          <w:color w:val="1F3864"/>
-          <w:sz w:val="32"/>
-          <w:szCs w:val="32"/>
-        </w:rPr>
-        <w:t xml:space="preserve">10. Repositorio y Video</w:t>
-      </w:r>
-    </w:p>
-    <w:p>
-      <w:pPr>
-        <w:spacing w:after="120"/>
-      </w:pPr>
-      <w:r>
-        <w:rPr>
-          <w:b/>
-          <w:bCs/>
-          <w:sz w:val="22"/>
-          <w:szCs w:val="22"/>
-        </w:rPr>
-        <w:t xml:space="preserve">Repositorio GitHub:</w:t>
-      </w:r>
-    </w:p>
-    <w:p>
-      <w:pPr>
-        <w:spacing w:after="120"/>
-      </w:pPr>
-      <w:r>
-        <w:rPr>
-          <w:sz w:val="22"/>
-          <w:szCs w:val="22"/>
-        </w:rPr>
-        <w:t xml:space="preserve">https://github.com/JosueSolano2008/Proyecto_2_Defensa_Asalto_Base</w:t>
-      </w:r>
-    </w:p>
-    <w:p>
-      <w:pPr>
-        <w:spacing w:after="120"/>
-      </w:pPr>
-      <w:r>
-        <w:rPr>
-          <w:b/>
-          <w:bCs/>
-          <w:sz w:val="22"/>
-          <w:szCs w:val="22"/>
-        </w:rPr>
-        <w:t xml:space="preserve">Video evidencia de desarrollo (10 min):</w:t>
-      </w:r>
-    </w:p>
-    <w:p>
-      <w:pPr>
-        <w:spacing w:after="120"/>
-      </w:pPr>
-      <w:r>
-        <w:rPr>
-          <w:sz w:val="22"/>
-          <w:szCs w:val="22"/>
-        </w:rPr>
-        <w:t xml:space="preserve">[Enlace al video — pendiente de agregar]</w:t>
-      </w:r>
-    </w:p>
-    <w:p>
-      <w:pPr>
-        <w:pStyle w:val="Heading1"/>
-      </w:pPr>
-      <w:r>
-        <w:rPr>
-          <w:b/>
-          <w:bCs/>
-          <w:color w:val="1F3864"/>
-          <w:sz w:val="32"/>
-          <w:szCs w:val="32"/>
-        </w:rPr>
-        <w:t xml:space="preserve">11. Instrucciones para Ejecutar</w:t>
-      </w:r>
-    </w:p>
-    <w:p>
-      <w:pPr>
-        <w:pStyle w:val="ListParagraph"/>
-        <w:numPr>
-          <w:ilvl w:val="0"/>
-          <w:numId w:val="3"/>
-        </w:numPr>
-        <w:spacing w:after="80"/>
-      </w:pPr>
-      <w:r>
-        <w:rPr>
-          <w:sz w:val="22"/>
-          <w:szCs w:val="22"/>
-        </w:rPr>
-        <w:t xml:space="preserve">Descomprimir el .zip en una carpeta local</w:t>
-      </w:r>
-    </w:p>
-    <w:p>
-      <w:pPr>
-        <w:pStyle w:val="ListParagraph"/>
-        <w:numPr>
-          <w:ilvl w:val="0"/>
-          <w:numId w:val="3"/>
-        </w:numPr>
-        <w:spacing w:after="80"/>
-      </w:pPr>
-      <w:r>
-        <w:rPr>
-          <w:sz w:val="22"/>
-          <w:szCs w:val="22"/>
-        </w:rPr>
-        <w:t xml:space="preserve">Navegar a la carpeta proyecto_final/ desde la terminal</w:t>
-      </w:r>
-    </w:p>
-    <w:p>
-      <w:pPr>
-        <w:pStyle w:val="ListParagraph"/>
-        <w:numPr>
-          <w:ilvl w:val="0"/>
-          <w:numId w:val="3"/>
-        </w:numPr>
-        <w:spacing w:after="80"/>
-      </w:pPr>
-      <w:r>
-        <w:rPr>
-          <w:sz w:val="22"/>
-          <w:szCs w:val="22"/>
-        </w:rPr>
-        <w:t xml:space="preserve">Ejecutar: pip install Pillow</w:t>
-      </w:r>
-    </w:p>
-    <w:p>
-      <w:pPr>
-        <w:pStyle w:val="ListParagraph"/>
-        <w:numPr>
-          <w:ilvl w:val="0"/>
-          <w:numId w:val="3"/>
-        </w:numPr>
-        <w:spacing w:after="80"/>
-      </w:pPr>
-      <w:r>
-        <w:rPr>
-          <w:sz w:val="22"/>
-          <w:szCs w:val="22"/>
-        </w:rPr>
-        <w:t xml:space="preserve">Ejecutar: python main.py</w:t>
-      </w:r>
-    </w:p>
-    <w:p>
-      <w:pPr>
-        <w:pStyle w:val="Heading1"/>
-      </w:pPr>
-      <w:r>
-        <w:rPr>
-          <w:b/>
-          <w:bCs/>
-          <w:color w:val="1F3864"/>
-          <w:sz w:val="32"/>
-          <w:szCs w:val="32"/>
-        </w:rPr>
-        <w:t xml:space="preserve">12. Conclusiones Individuales</w:t>
+        <w:t xml:space="preserve">13. Conclusiones Individuales</w:t>
       </w:r>
     </w:p>
     <w:p>
@@ -4475,7 +4267,7 @@
           <w:sz w:val="26"/>
           <w:szCs w:val="26"/>
         </w:rPr>
-        <w:t xml:space="preserve">David De Jesús Zamora Villalobos</w:t>
+        <w:t xml:space="preserve">13.1 David De Jesús Zamora Villalobos</w:t>
       </w:r>
     </w:p>
     <w:p>
@@ -4502,7 +4294,7 @@
           <w:sz w:val="26"/>
           <w:szCs w:val="26"/>
         </w:rPr>
-        <w:t xml:space="preserve">Josué David Solano Monge</w:t>
+        <w:t xml:space="preserve">13.2 Josué David Solano Monge</w:t>
       </w:r>
     </w:p>
     <w:p>

</xml_diff>

<commit_message>
docs: agregar 5 capturas de pantalla en seccion 12 de Documentacion_Tecnica
</commit_message>
<xml_diff>
--- a/Documentacion_Tecnica.docx
+++ b/Documentacion_Tecnica.docx
@@ -4176,8 +4176,8 @@
           <w:b/>
           <w:bCs/>
           <w:color w:val="2E75B6"/>
-          <w:sz w:val="26"/>
-          <w:szCs w:val="26"/>
+          <w:sz w:val="28"/>
+          <w:szCs w:val="28"/>
         </w:rPr>
         <w:t xml:space="preserve">12.1 Pantalla de Login</w:t>
       </w:r>
@@ -4191,20 +4191,20 @@
           <w:sz w:val="22"/>
           <w:szCs w:val="22"/>
         </w:rPr>
-        <w:t xml:space="preserve">La pantalla de inicio de sesión permite a ambos jugadores autenticarse antes de comenzar la partida. Cada jugador ingresa su usuario y contraseña. El sistema confirma la sesión con un mensaje verde.</w:t>
-      </w:r>
-    </w:p>
-    <w:p>
-      <w:pPr>
-        <w:spacing w:after="200"/>
+        <w:t xml:space="preserve">La pantalla de inicio de sesión permite a ambos jugadores autenticarse antes de comenzar la partida.</w:t>
+      </w:r>
+    </w:p>
+    <w:p>
+      <w:pPr>
+        <w:spacing w:after="120"/>
         <w:jc w:val="center"/>
       </w:pPr>
       <w:r>
         <w:drawing>
           <wp:inline distT="0" distB="0" distL="0" distR="0">
-            <wp:extent cx="3238500" cy="3448050"/>
+            <wp:extent cx="5486400" cy="4709160"/>
             <wp:effectExtent t="0" r="0" b="0" l="0"/>
-            <wp:docPr id="1" name="" descr="" title=""/>
+            <wp:docPr id="10" name="12.1 Pantalla de Login" descr="12.1 Pantalla de Login" title="12.1 Pantalla de Login"/>
             <wp:cNvGraphicFramePr>
               <a:graphicFrameLocks xmlns:a="http://schemas.openxmlformats.org/drawingml/2006/main" noChangeAspect="1"/>
             </wp:cNvGraphicFramePr>
@@ -4212,13 +4212,13 @@
               <a:graphicData uri="http://schemas.openxmlformats.org/drawingml/2006/picture">
                 <pic:pic xmlns:pic="http://schemas.openxmlformats.org/drawingml/2006/picture">
                   <pic:nvPicPr>
-                    <pic:cNvPr id="0" name="" descr=""/>
+                    <pic:cNvPr id="0" name="12.1 Pantalla de Login"/>
                     <pic:cNvPicPr>
                       <a:picLocks noChangeAspect="1" noChangeArrowheads="1"/>
                     </pic:cNvPicPr>
                   </pic:nvPicPr>
                   <pic:blipFill>
-                    <a:blip r:embed="rId8" cstate="none"/>
+                    <a:blip r:embed="rId10" cstate="none"/>
                     <a:srcRect/>
                     <a:stretch>
                       <a:fillRect/>
@@ -4227,7 +4227,299 @@
                   <pic:spPr bwMode="auto">
                     <a:xfrm>
                       <a:off x="0" y="0"/>
-                      <a:ext cx="3238500" cy="3448050"/>
+                      <a:ext cx="5486400" cy="4709160"/>
+                    </a:xfrm>
+                    <a:prstGeom prst="rect">
+                      <a:avLst/>
+                    </a:prstGeom>
+                  </pic:spPr>
+                </pic:pic>
+              </a:graphicData>
+            </a:graphic>
+          </wp:inline>
+        </w:drawing>
+      </w:r>
+    </w:p>
+    <w:p>
+      <w:pPr>
+        <w:pStyle w:val="Heading2"/>
+      </w:pPr>
+      <w:r>
+        <w:rPr>
+          <w:b/>
+          <w:bCs/>
+          <w:color w:val="2E75B6"/>
+          <w:sz w:val="28"/>
+          <w:szCs w:val="28"/>
+        </w:rPr>
+        <w:t xml:space="preserve">12.2 Selección de Facción</w:t>
+      </w:r>
+    </w:p>
+    <w:p>
+      <w:pPr>
+        <w:spacing w:after="120"/>
+      </w:pPr>
+      <w:r>
+        <w:rPr>
+          <w:sz w:val="22"/>
+          <w:szCs w:val="22"/>
+        </w:rPr>
+        <w:t xml:space="preserve">Cada jugador elige su facción (Imperio, Rebeldes o Reinado). El defensor y el atacante no pueden usar la misma facción.</w:t>
+      </w:r>
+    </w:p>
+    <w:p>
+      <w:pPr>
+        <w:spacing w:after="120"/>
+        <w:jc w:val="center"/>
+      </w:pPr>
+      <w:r>
+        <w:drawing>
+          <wp:inline distT="0" distB="0" distL="0" distR="0">
+            <wp:extent cx="5486400" cy="3191256"/>
+            <wp:effectExtent t="0" r="0" b="0" l="0"/>
+            <wp:docPr id="11" name="12.2 Selección de Facción" descr="12.2 Selección de Facción" title="12.2 Selección de Facción"/>
+            <wp:cNvGraphicFramePr>
+              <a:graphicFrameLocks xmlns:a="http://schemas.openxmlformats.org/drawingml/2006/main" noChangeAspect="1"/>
+            </wp:cNvGraphicFramePr>
+            <a:graphic xmlns:a="http://schemas.openxmlformats.org/drawingml/2006/main">
+              <a:graphicData uri="http://schemas.openxmlformats.org/drawingml/2006/picture">
+                <pic:pic xmlns:pic="http://schemas.openxmlformats.org/drawingml/2006/picture">
+                  <pic:nvPicPr>
+                    <pic:cNvPr id="0" name="12.2 Selección de Facción"/>
+                    <pic:cNvPicPr>
+                      <a:picLocks noChangeAspect="1" noChangeArrowheads="1"/>
+                    </pic:cNvPicPr>
+                  </pic:nvPicPr>
+                  <pic:blipFill>
+                    <a:blip r:embed="rId11" cstate="none"/>
+                    <a:srcRect/>
+                    <a:stretch>
+                      <a:fillRect/>
+                    </a:stretch>
+                  </pic:blipFill>
+                  <pic:spPr bwMode="auto">
+                    <a:xfrm>
+                      <a:off x="0" y="0"/>
+                      <a:ext cx="5486400" cy="3191256"/>
+                    </a:xfrm>
+                    <a:prstGeom prst="rect">
+                      <a:avLst/>
+                    </a:prstGeom>
+                  </pic:spPr>
+                </pic:pic>
+              </a:graphicData>
+            </a:graphic>
+          </wp:inline>
+        </w:drawing>
+      </w:r>
+    </w:p>
+    <w:p>
+      <w:pPr>
+        <w:pStyle w:val="Heading2"/>
+      </w:pPr>
+      <w:r>
+        <w:rPr>
+          <w:b/>
+          <w:bCs/>
+          <w:color w:val="2E75B6"/>
+          <w:sz w:val="28"/>
+          <w:szCs w:val="28"/>
+        </w:rPr>
+        <w:t xml:space="preserve">12.3 Fase Defensor — Mapa</w:t>
+      </w:r>
+    </w:p>
+    <w:p>
+      <w:pPr>
+        <w:spacing w:after="120"/>
+      </w:pPr>
+      <w:r>
+        <w:rPr>
+          <w:sz w:val="22"/>
+          <w:szCs w:val="22"/>
+        </w:rPr>
+        <w:t xml:space="preserve">El defensor coloca torres y muros en el mapa 10x10 durante su fase de construcción.</w:t>
+      </w:r>
+    </w:p>
+    <w:p>
+      <w:pPr>
+        <w:spacing w:after="120"/>
+        <w:jc w:val="center"/>
+      </w:pPr>
+      <w:r>
+        <w:drawing>
+          <wp:inline distT="0" distB="0" distL="0" distR="0">
+            <wp:extent cx="5486400" cy="2231136"/>
+            <wp:effectExtent t="0" r="0" b="0" l="0"/>
+            <wp:docPr id="12" name="12.3 Fase Defensor — Mapa" descr="12.3 Fase Defensor — Mapa" title="12.3 Fase Defensor — Mapa"/>
+            <wp:cNvGraphicFramePr>
+              <a:graphicFrameLocks xmlns:a="http://schemas.openxmlformats.org/drawingml/2006/main" noChangeAspect="1"/>
+            </wp:cNvGraphicFramePr>
+            <a:graphic xmlns:a="http://schemas.openxmlformats.org/drawingml/2006/main">
+              <a:graphicData uri="http://schemas.openxmlformats.org/drawingml/2006/picture">
+                <pic:pic xmlns:pic="http://schemas.openxmlformats.org/drawingml/2006/picture">
+                  <pic:nvPicPr>
+                    <pic:cNvPr id="0" name="12.3 Fase Defensor — Mapa"/>
+                    <pic:cNvPicPr>
+                      <a:picLocks noChangeAspect="1" noChangeArrowheads="1"/>
+                    </pic:cNvPicPr>
+                  </pic:nvPicPr>
+                  <pic:blipFill>
+                    <a:blip r:embed="rId12" cstate="none"/>
+                    <a:srcRect/>
+                    <a:stretch>
+                      <a:fillRect/>
+                    </a:stretch>
+                  </pic:blipFill>
+                  <pic:spPr bwMode="auto">
+                    <a:xfrm>
+                      <a:off x="0" y="0"/>
+                      <a:ext cx="5486400" cy="2231136"/>
+                    </a:xfrm>
+                    <a:prstGeom prst="rect">
+                      <a:avLst/>
+                    </a:prstGeom>
+                  </pic:spPr>
+                </pic:pic>
+              </a:graphicData>
+            </a:graphic>
+          </wp:inline>
+        </w:drawing>
+      </w:r>
+    </w:p>
+    <w:p>
+      <w:pPr>
+        <w:pStyle w:val="Heading2"/>
+      </w:pPr>
+      <w:r>
+        <w:rPr>
+          <w:b/>
+          <w:bCs/>
+          <w:color w:val="2E75B6"/>
+          <w:sz w:val="28"/>
+          <w:szCs w:val="28"/>
+        </w:rPr>
+        <w:t xml:space="preserve">12.4 Fase de Combate</w:t>
+      </w:r>
+    </w:p>
+    <w:p>
+      <w:pPr>
+        <w:spacing w:after="120"/>
+      </w:pPr>
+      <w:r>
+        <w:rPr>
+          <w:sz w:val="22"/>
+          <w:szCs w:val="22"/>
+        </w:rPr>
+        <w:t xml:space="preserve">Vista del combate automático con log de eventos en tiempo real. Las torres atacan a las unidades enemigas por turnos.</w:t>
+      </w:r>
+    </w:p>
+    <w:p>
+      <w:pPr>
+        <w:spacing w:after="120"/>
+        <w:jc w:val="center"/>
+      </w:pPr>
+      <w:r>
+        <w:drawing>
+          <wp:inline distT="0" distB="0" distL="0" distR="0">
+            <wp:extent cx="5486400" cy="1956816"/>
+            <wp:effectExtent t="0" r="0" b="0" l="0"/>
+            <wp:docPr id="13" name="12.4 Fase de Combate" descr="12.4 Fase de Combate" title="12.4 Fase de Combate"/>
+            <wp:cNvGraphicFramePr>
+              <a:graphicFrameLocks xmlns:a="http://schemas.openxmlformats.org/drawingml/2006/main" noChangeAspect="1"/>
+            </wp:cNvGraphicFramePr>
+            <a:graphic xmlns:a="http://schemas.openxmlformats.org/drawingml/2006/main">
+              <a:graphicData uri="http://schemas.openxmlformats.org/drawingml/2006/picture">
+                <pic:pic xmlns:pic="http://schemas.openxmlformats.org/drawingml/2006/picture">
+                  <pic:nvPicPr>
+                    <pic:cNvPr id="0" name="12.4 Fase de Combate"/>
+                    <pic:cNvPicPr>
+                      <a:picLocks noChangeAspect="1" noChangeArrowheads="1"/>
+                    </pic:cNvPicPr>
+                  </pic:nvPicPr>
+                  <pic:blipFill>
+                    <a:blip r:embed="rId13" cstate="none"/>
+                    <a:srcRect/>
+                    <a:stretch>
+                      <a:fillRect/>
+                    </a:stretch>
+                  </pic:blipFill>
+                  <pic:spPr bwMode="auto">
+                    <a:xfrm>
+                      <a:off x="0" y="0"/>
+                      <a:ext cx="5486400" cy="1956816"/>
+                    </a:xfrm>
+                    <a:prstGeom prst="rect">
+                      <a:avLst/>
+                    </a:prstGeom>
+                  </pic:spPr>
+                </pic:pic>
+              </a:graphicData>
+            </a:graphic>
+          </wp:inline>
+        </w:drawing>
+      </w:r>
+    </w:p>
+    <w:p>
+      <w:pPr>
+        <w:pStyle w:val="Heading2"/>
+      </w:pPr>
+      <w:r>
+        <w:rPr>
+          <w:b/>
+          <w:bCs/>
+          <w:color w:val="2E75B6"/>
+          <w:sz w:val="28"/>
+          <w:szCs w:val="28"/>
+        </w:rPr>
+        <w:t xml:space="preserve">12.5 Fin de Partida y Ranking</w:t>
+      </w:r>
+    </w:p>
+    <w:p>
+      <w:pPr>
+        <w:spacing w:after="120"/>
+      </w:pPr>
+      <w:r>
+        <w:rPr>
+          <w:sz w:val="22"/>
+          <w:szCs w:val="22"/>
+        </w:rPr>
+        <w:t xml:space="preserve">Pantalla de fin de partida mostrando al ganador y el top 5 de jugadores como defensor y atacante.</w:t>
+      </w:r>
+    </w:p>
+    <w:p>
+      <w:pPr>
+        <w:spacing w:after="120"/>
+        <w:jc w:val="center"/>
+      </w:pPr>
+      <w:r>
+        <w:drawing>
+          <wp:inline distT="0" distB="0" distL="0" distR="0">
+            <wp:extent cx="5486400" cy="2212848"/>
+            <wp:effectExtent t="0" r="0" b="0" l="0"/>
+            <wp:docPr id="14" name="12.5 Fin de Partida y Ranking" descr="12.5 Fin de Partida y Ranking" title="12.5 Fin de Partida y Ranking"/>
+            <wp:cNvGraphicFramePr>
+              <a:graphicFrameLocks xmlns:a="http://schemas.openxmlformats.org/drawingml/2006/main" noChangeAspect="1"/>
+            </wp:cNvGraphicFramePr>
+            <a:graphic xmlns:a="http://schemas.openxmlformats.org/drawingml/2006/main">
+              <a:graphicData uri="http://schemas.openxmlformats.org/drawingml/2006/picture">
+                <pic:pic xmlns:pic="http://schemas.openxmlformats.org/drawingml/2006/picture">
+                  <pic:nvPicPr>
+                    <pic:cNvPr id="0" name="12.5 Fin de Partida y Ranking"/>
+                    <pic:cNvPicPr>
+                      <a:picLocks noChangeAspect="1" noChangeArrowheads="1"/>
+                    </pic:cNvPicPr>
+                  </pic:nvPicPr>
+                  <pic:blipFill>
+                    <a:blip r:embed="rId14" cstate="none"/>
+                    <a:srcRect/>
+                    <a:stretch>
+                      <a:fillRect/>
+                    </a:stretch>
+                  </pic:blipFill>
+                  <pic:spPr bwMode="auto">
+                    <a:xfrm>
+                      <a:off x="0" y="0"/>
+                      <a:ext cx="5486400" cy="2212848"/>
                     </a:xfrm>
                     <a:prstGeom prst="rect">
                       <a:avLst/>

</xml_diff>